<commit_message>
docs: added a new revision for the blog
</commit_message>
<xml_diff>
--- a/building_a_visit_counter.docx
+++ b/building_a_visit_counter.docx
@@ -19,67 +19,247 @@
     </w:p>
     <w:p>
       <w:pPr>
-        <w:rPr>
-          <w:sz w:val="24"/>
-          <w:szCs w:val="24"/>
-        </w:rPr>
-      </w:pPr>
-      <w:r>
-        <w:rPr>
-          <w:sz w:val="24"/>
-          <w:szCs w:val="24"/>
-          <w:rtl w:val="0"/>
-        </w:rPr>
-        <w:t xml:space="preserve">Imagine you are an orange merchant. Every day, you’d bring your baskets of fruit to the nearby farmer's market to trade your labor, and come home selling some of them. At dinner, your family asks you how many oranges you sell, and you yawn with a number you made up 2 seconds ago.</w:t>
-      </w:r>
-    </w:p>
-    <w:p>
-      <w:pPr>
-        <w:rPr>
-          <w:sz w:val="24"/>
-          <w:szCs w:val="24"/>
-        </w:rPr>
-      </w:pPr>
-      <w:r>
-        <w:rPr>
-          <w:sz w:val="24"/>
-          <w:szCs w:val="24"/>
-          <w:rtl w:val="0"/>
-        </w:rPr>
-        <w:t xml:space="preserve">That’s ridiculous! - Some may say.</w:t>
-      </w:r>
-    </w:p>
-    <w:p>
-      <w:pPr>
-        <w:spacing w:after="120" w:lineRule="auto"/>
-        <w:rPr>
-          <w:sz w:val="24"/>
-          <w:szCs w:val="24"/>
-        </w:rPr>
-      </w:pPr>
-      <w:r>
-        <w:rPr>
-          <w:sz w:val="24"/>
-          <w:szCs w:val="24"/>
-          <w:rtl w:val="0"/>
-        </w:rPr>
-        <w:t xml:space="preserve">Yet that’s the story of many websites- they lack analytics, or any form of tracking that allows builders to observe their presence on the internet. Tracking sounds vast, but once you break it down, some main components are incredibly simple and intuitive to build. One of them is an engine to answer the question: “How many people visit my site today?” Knowing that number, you can measure how compelling a piece of content you deliver to your audience, hence craft it according to their taste. And that’s exactly what we’re going to build today- a visit counter website.</w:t>
-      </w:r>
-    </w:p>
-    <w:p>
-      <w:pPr>
+        <w:rPr/>
+      </w:pPr>
+      <w:r>
+        <w:rPr>
+          <w:rtl w:val="0"/>
+        </w:rPr>
+        <w:t xml:space="preserve">(The full code: </w:t>
+      </w:r>
+      <w:hyperlink r:id="rId7">
+        <w:r>
+          <w:rPr>
+            <w:color w:val="1155cc"/>
+            <w:u w:val="single"/>
+            <w:rtl w:val="0"/>
+          </w:rPr>
+          <w:t xml:space="preserve">https://github.com/petercrackthecode/visit_counter</w:t>
+        </w:r>
+      </w:hyperlink>
+      <w:r>
+        <w:rPr>
+          <w:rtl w:val="0"/>
+        </w:rPr>
+        <w:t xml:space="preserve">)</w:t>
+      </w:r>
+    </w:p>
+    <w:p>
+      <w:pPr>
+        <w:rPr/>
+      </w:pPr>
+      <w:r>
+        <w:pict>
+          <v:rect style="width:0.0pt;height:1.5pt" o:hr="t" o:hrstd="t" o:hralign="center" fillcolor="#A0A0A0" stroked="f"/>
+        </w:pict>
+      </w:r>
+      <w:r>
+        <w:rPr>
+          <w:rtl w:val="0"/>
+        </w:rPr>
+      </w:r>
+    </w:p>
+    <w:p>
+      <w:pPr>
+        <w:rPr/>
+      </w:pPr>
+      <w:r>
+        <w:rPr>
+          <w:rtl w:val="0"/>
+        </w:rPr>
+      </w:r>
+    </w:p>
+    <w:p>
+      <w:pPr>
+        <w:rPr>
+          <w:sz w:val="24"/>
+          <w:szCs w:val="24"/>
+        </w:rPr>
+      </w:pPr>
+      <w:r>
+        <w:rPr>
+          <w:sz w:val="24"/>
+          <w:szCs w:val="24"/>
+          <w:rtl w:val="0"/>
+        </w:rPr>
+        <w:t xml:space="preserve">Imagine you are an orange merchant. Every day, you’d bring your baskets of fruit to the nearby farmer's market to trade your labor, </w:t>
+      </w:r>
+      <w:r>
+        <w:rPr>
+          <w:sz w:val="24"/>
+          <w:szCs w:val="24"/>
+          <w:rtl w:val="0"/>
+        </w:rPr>
+        <w:t xml:space="preserve">and come home after selling some of them</w:t>
+      </w:r>
+      <w:r>
+        <w:rPr>
+          <w:sz w:val="24"/>
+          <w:szCs w:val="24"/>
+          <w:rtl w:val="0"/>
+        </w:rPr>
+        <w:t xml:space="preserve">. At dinner, your family asks you </w:t>
+      </w:r>
+      <w:r>
+        <w:rPr>
+          <w:sz w:val="24"/>
+          <w:szCs w:val="24"/>
+          <w:rtl w:val="0"/>
+        </w:rPr>
+        <w:t xml:space="preserve">how many oranges you </w:t>
+      </w:r>
+      <w:r>
+        <w:rPr>
+          <w:sz w:val="24"/>
+          <w:szCs w:val="24"/>
+          <w:rtl w:val="0"/>
+        </w:rPr>
+        <w:t xml:space="preserve">sold, and you yawn with a number you made up 2 seconds ago.</w:t>
+      </w:r>
+    </w:p>
+    <w:p>
+      <w:pPr>
+        <w:rPr>
+          <w:sz w:val="24"/>
+          <w:szCs w:val="24"/>
+        </w:rPr>
+      </w:pPr>
+      <w:r>
+        <w:rPr>
+          <w:sz w:val="24"/>
+          <w:szCs w:val="24"/>
+          <w:rtl w:val="0"/>
+        </w:rPr>
+        <w:t xml:space="preserve">“That’s ridiculous!” some may say.</w:t>
+      </w:r>
+    </w:p>
+    <w:p>
+      <w:pPr>
+        <w:jc w:val="center"/>
+        <w:rPr>
+          <w:sz w:val="24"/>
+          <w:szCs w:val="24"/>
+        </w:rPr>
+      </w:pPr>
+      <w:r>
+        <w:rPr>
+          <w:sz w:val="24"/>
+          <w:szCs w:val="24"/>
+        </w:rPr>
+        <w:drawing>
+          <wp:inline distB="114300" distT="114300" distL="114300" distR="114300">
+            <wp:extent cx="3178175" cy="4767263"/>
+            <wp:effectExtent b="0" l="0" r="0" t="0"/>
+            <wp:docPr id="4" name="image3.png"/>
+            <a:graphic>
+              <a:graphicData uri="http://schemas.openxmlformats.org/drawingml/2006/picture">
+                <pic:pic>
+                  <pic:nvPicPr>
+                    <pic:cNvPr id="0" name="image3.png"/>
+                    <pic:cNvPicPr preferRelativeResize="0"/>
+                  </pic:nvPicPr>
+                  <pic:blipFill>
+                    <a:blip r:embed="rId8"/>
+                    <a:srcRect b="0" l="0" r="0" t="0"/>
+                    <a:stretch>
+                      <a:fillRect/>
+                    </a:stretch>
+                  </pic:blipFill>
+                  <pic:spPr>
+                    <a:xfrm>
+                      <a:off x="0" y="0"/>
+                      <a:ext cx="3178175" cy="4767263"/>
+                    </a:xfrm>
+                    <a:prstGeom prst="rect"/>
+                    <a:ln/>
+                  </pic:spPr>
+                </pic:pic>
+              </a:graphicData>
+            </a:graphic>
+          </wp:inline>
+        </w:drawing>
+      </w:r>
+      <w:r>
+        <w:rPr>
+          <w:rtl w:val="0"/>
+        </w:rPr>
+      </w:r>
+    </w:p>
+    <w:p>
+      <w:pPr>
+        <w:spacing w:after="120" w:lineRule="auto"/>
+        <w:rPr>
+          <w:sz w:val="24"/>
+          <w:szCs w:val="24"/>
+        </w:rPr>
+      </w:pPr>
+      <w:r>
+        <w:rPr>
+          <w:sz w:val="24"/>
+          <w:szCs w:val="24"/>
+          <w:rtl w:val="0"/>
+        </w:rPr>
+        <w:t xml:space="preserve">Yet that’s the story of many websites- they lack analytics, or any form of tracking that allows builders to observe their presence on the internet. </w:t>
+      </w:r>
+      <w:r>
+        <w:rPr>
+          <w:sz w:val="24"/>
+          <w:szCs w:val="24"/>
+          <w:rtl w:val="0"/>
+        </w:rPr>
+        <w:t xml:space="preserve">Tracking sounds </w:t>
+      </w:r>
+      <w:r>
+        <w:rPr>
+          <w:sz w:val="24"/>
+          <w:szCs w:val="24"/>
+          <w:rtl w:val="0"/>
+        </w:rPr>
+        <w:t xml:space="preserve">vague, but once you break it down,</w:t>
+      </w:r>
+      <w:r>
+        <w:rPr>
+          <w:sz w:val="24"/>
+          <w:szCs w:val="24"/>
+          <w:rtl w:val="0"/>
+        </w:rPr>
+        <w:t xml:space="preserve"> </w:t>
+      </w:r>
+      <w:r>
+        <w:rPr>
+          <w:sz w:val="24"/>
+          <w:szCs w:val="24"/>
+          <w:rtl w:val="0"/>
+        </w:rPr>
+        <w:t xml:space="preserve">the main components are incredibly simple and intuitive to build. One of them is an engine to answer the question: “How many people visit my site today?” Knowing that number, you can measure how compelling a piece of content you deliver to your audience is</w:t>
+      </w:r>
+      <w:r>
+        <w:rPr>
+          <w:sz w:val="24"/>
+          <w:szCs w:val="24"/>
+          <w:rtl w:val="0"/>
+        </w:rPr>
+        <w:t xml:space="preserve">, and craft it according to their taste</w:t>
+      </w:r>
+      <w:r>
+        <w:rPr>
+          <w:sz w:val="24"/>
+          <w:szCs w:val="24"/>
+          <w:rtl w:val="0"/>
+        </w:rPr>
+        <w:t xml:space="preserve">. And in this post I’m going to show you how to build a visit counter website.</w:t>
+      </w:r>
+    </w:p>
+    <w:p>
+      <w:pPr>
+        <w:pStyle w:val="Heading3"/>
         <w:spacing w:after="60" w:lineRule="auto"/>
-        <w:rPr>
-          <w:color w:val="414144"/>
-          <w:sz w:val="24"/>
-          <w:szCs w:val="24"/>
-        </w:rPr>
-      </w:pPr>
-      <w:r>
-        <w:rPr>
-          <w:color w:val="414144"/>
-          <w:sz w:val="24"/>
-          <w:szCs w:val="24"/>
+        <w:rPr/>
+      </w:pPr>
+      <w:bookmarkStart w:colFirst="0" w:colLast="0" w:name="_opqsk52r7eqf" w:id="1"/>
+      <w:bookmarkEnd w:id="1"/>
+      <w:r>
+        <w:rPr>
           <w:rtl w:val="0"/>
         </w:rPr>
         <w:t xml:space="preserve">The ingredients</w:t>
@@ -169,6 +349,58 @@
     </w:p>
     <w:p>
       <w:pPr>
+        <w:spacing w:after="240" w:before="240" w:lineRule="auto"/>
+        <w:rPr>
+          <w:sz w:val="24"/>
+          <w:szCs w:val="24"/>
+        </w:rPr>
+      </w:pPr>
+      <w:r>
+        <w:rPr>
+          <w:sz w:val="24"/>
+          <w:szCs w:val="24"/>
+        </w:rPr>
+        <w:drawing>
+          <wp:inline distB="114300" distT="114300" distL="114300" distR="114300">
+            <wp:extent cx="5943600" cy="3327400"/>
+            <wp:effectExtent b="0" l="0" r="0" t="0"/>
+            <wp:docPr id="1" name="image2.png"/>
+            <a:graphic>
+              <a:graphicData uri="http://schemas.openxmlformats.org/drawingml/2006/picture">
+                <pic:pic>
+                  <pic:nvPicPr>
+                    <pic:cNvPr id="0" name="image2.png"/>
+                    <pic:cNvPicPr preferRelativeResize="0"/>
+                  </pic:nvPicPr>
+                  <pic:blipFill>
+                    <a:blip r:embed="rId9"/>
+                    <a:srcRect b="0" l="0" r="0" t="0"/>
+                    <a:stretch>
+                      <a:fillRect/>
+                    </a:stretch>
+                  </pic:blipFill>
+                  <pic:spPr>
+                    <a:xfrm>
+                      <a:off x="0" y="0"/>
+                      <a:ext cx="5943600" cy="3327400"/>
+                    </a:xfrm>
+                    <a:prstGeom prst="rect"/>
+                    <a:ln/>
+                  </pic:spPr>
+                </pic:pic>
+              </a:graphicData>
+            </a:graphic>
+          </wp:inline>
+        </w:drawing>
+      </w:r>
+      <w:r>
+        <w:rPr>
+          <w:rtl w:val="0"/>
+        </w:rPr>
+      </w:r>
+    </w:p>
+    <w:p>
+      <w:pPr>
         <w:ind w:left="280" w:firstLine="0"/>
         <w:rPr>
           <w:sz w:val="24"/>
@@ -373,20 +605,94 @@
           <w:ilvl w:val="0"/>
           <w:numId w:val="6"/>
         </w:numPr>
+        <w:spacing w:after="240" w:before="240" w:lineRule="auto"/>
+        <w:ind w:left="720" w:hanging="360"/>
+        <w:rPr>
+          <w:sz w:val="24"/>
+          <w:szCs w:val="24"/>
+        </w:rPr>
+      </w:pPr>
+      <w:r>
+        <w:rPr>
+          <w:sz w:val="24"/>
+          <w:szCs w:val="24"/>
+          <w:rtl w:val="0"/>
+        </w:rPr>
+        <w:t xml:space="preserve">Now we have two main pieces, let’s cook. First, for the database, we can store the count value into a file, a database, or an in-memory storage like a key-value store. Let’s evaluate each of them:</w:t>
+      </w:r>
+    </w:p>
+    <w:p>
+      <w:pPr>
+        <w:spacing w:after="240" w:before="240" w:lineRule="auto"/>
+        <w:rPr>
+          <w:sz w:val="24"/>
+          <w:szCs w:val="24"/>
+        </w:rPr>
+      </w:pPr>
+      <w:r>
+        <w:rPr>
+          <w:sz w:val="24"/>
+          <w:szCs w:val="24"/>
+        </w:rPr>
+        <w:drawing>
+          <wp:inline distB="114300" distT="114300" distL="114300" distR="114300">
+            <wp:extent cx="5943600" cy="3962400"/>
+            <wp:effectExtent b="0" l="0" r="0" t="0"/>
+            <wp:docPr id="3" name="image1.png"/>
+            <a:graphic>
+              <a:graphicData uri="http://schemas.openxmlformats.org/drawingml/2006/picture">
+                <pic:pic>
+                  <pic:nvPicPr>
+                    <pic:cNvPr id="0" name="image1.png"/>
+                    <pic:cNvPicPr preferRelativeResize="0"/>
+                  </pic:nvPicPr>
+                  <pic:blipFill>
+                    <a:blip r:embed="rId10"/>
+                    <a:srcRect b="0" l="0" r="0" t="0"/>
+                    <a:stretch>
+                      <a:fillRect/>
+                    </a:stretch>
+                  </pic:blipFill>
+                  <pic:spPr>
+                    <a:xfrm>
+                      <a:off x="0" y="0"/>
+                      <a:ext cx="5943600" cy="3962400"/>
+                    </a:xfrm>
+                    <a:prstGeom prst="rect"/>
+                    <a:ln/>
+                  </pic:spPr>
+                </pic:pic>
+              </a:graphicData>
+            </a:graphic>
+          </wp:inline>
+        </w:drawing>
+      </w:r>
+      <w:r>
+        <w:rPr>
+          <w:rtl w:val="0"/>
+        </w:rPr>
+      </w:r>
+    </w:p>
+    <w:p>
+      <w:pPr>
+        <w:numPr>
+          <w:ilvl w:val="1"/>
+          <w:numId w:val="6"/>
+        </w:numPr>
         <w:spacing w:after="0" w:afterAutospacing="0" w:before="240" w:lineRule="auto"/>
-        <w:ind w:left="720" w:hanging="360"/>
-        <w:rPr>
-          <w:sz w:val="24"/>
-          <w:szCs w:val="24"/>
-        </w:rPr>
-      </w:pPr>
-      <w:r>
-        <w:rPr>
-          <w:sz w:val="24"/>
-          <w:szCs w:val="24"/>
-          <w:rtl w:val="0"/>
-        </w:rPr>
-        <w:t xml:space="preserve">Now we have two main pieces, let’s cook. First, for the database, we can store the count value into a file, a database, or an in-memory storage like a key-value store. Let’s evaluate each of them:</w:t>
+        <w:ind w:left="1440" w:hanging="360"/>
+        <w:rPr>
+          <w:sz w:val="24"/>
+          <w:szCs w:val="24"/>
+        </w:rPr>
+      </w:pPr>
+      <w:r>
+        <w:rPr>
+          <w:sz w:val="24"/>
+          <w:szCs w:val="24"/>
+          <w:rtl w:val="0"/>
+        </w:rPr>
+        <w:t xml:space="preserve">Storing to a file is the most intuitive solution. We have a number representing a count, and we store that number in a text file. Reading and writing to a file are simple. Yet one problem occurs- file I/O doesn’t have a multithreading solution out of the box, so we will have to implement one ourselves. Plus, what if instead of a counter, we want to store additional information later? A file can account for that, but searching through a text file &amp; parsing is not ideal as our data grows.</w:t>
       </w:r>
     </w:p>
     <w:p>
@@ -408,7 +714,24 @@
           <w:szCs w:val="24"/>
           <w:rtl w:val="0"/>
         </w:rPr>
-        <w:t xml:space="preserve">Storing to a file is the most intuitive solution. We have a number representing a count, and we store that number in a text file. Reading and writing to a file are simple. Yet one problem occurs- file I/O doesn’t have a multithreading solution out of the box, so we will have to implement one ourselves. Plus, what if instead of a counter, we want to store additional information later? A file can account for that, but searching through a text file &amp; parsing is not ideal as our data grows.</w:t>
+        <w:t xml:space="preserve">The 2</w:t>
+      </w:r>
+      <w:r>
+        <w:rPr>
+          <w:sz w:val="24"/>
+          <w:szCs w:val="24"/>
+          <w:vertAlign w:val="superscript"/>
+          <w:rtl w:val="0"/>
+        </w:rPr>
+        <w:t xml:space="preserve">nd</w:t>
+      </w:r>
+      <w:r>
+        <w:rPr>
+          <w:sz w:val="24"/>
+          <w:szCs w:val="24"/>
+          <w:rtl w:val="0"/>
+        </w:rPr>
+        <w:t xml:space="preserve"> option is storing in a database. Modern databases are powerful with built-in locking to handle race conditions, plus powerful query capability. However, a database may be overkill for our v1. We can create a table for our data, but that table will stay one-rowed for a long time- we don’t need to track users yet, we simply want a counter with fast read and fast write. For many performant databases, these operations are rapid, yet we can raise our speed even more.</w:t>
       </w:r>
     </w:p>
     <w:p>
@@ -430,46 +753,7 @@
           <w:szCs w:val="24"/>
           <w:rtl w:val="0"/>
         </w:rPr>
-        <w:t xml:space="preserve">The 2</w:t>
-      </w:r>
-      <w:r>
-        <w:rPr>
-          <w:sz w:val="24"/>
-          <w:szCs w:val="24"/>
-          <w:vertAlign w:val="superscript"/>
-          <w:rtl w:val="0"/>
-        </w:rPr>
-        <w:t xml:space="preserve">nd</w:t>
-      </w:r>
-      <w:r>
-        <w:rPr>
-          <w:sz w:val="24"/>
-          <w:szCs w:val="24"/>
-          <w:rtl w:val="0"/>
-        </w:rPr>
-        <w:t xml:space="preserve"> option is storing in a database. Modern databases are powerful with built-in locking to handle race conditions, plus powerful query capability. However, a database may be overkill for our v1. We can create a table for our data, but that table will stay one-rowed for a long time- we don’t need to track users yet, we simply want a counter with fast read and fast write. For many performant databases, these operations are rapid, yet we can raise our speed even more.</w:t>
-      </w:r>
-    </w:p>
-    <w:p>
-      <w:pPr>
-        <w:numPr>
-          <w:ilvl w:val="1"/>
-          <w:numId w:val="6"/>
-        </w:numPr>
-        <w:spacing w:after="0" w:afterAutospacing="0" w:before="0" w:beforeAutospacing="0" w:lineRule="auto"/>
-        <w:ind w:left="1440" w:hanging="360"/>
-        <w:rPr>
-          <w:sz w:val="24"/>
-          <w:szCs w:val="24"/>
-        </w:rPr>
-      </w:pPr>
-      <w:r>
-        <w:rPr>
-          <w:sz w:val="24"/>
-          <w:szCs w:val="24"/>
-          <w:rtl w:val="0"/>
-        </w:rPr>
-        <w:t xml:space="preserve">A key-value storage is ideal for our problem at hand. With fast reads and writes &amp; a flexible data schema that operates well on small data, a key-value storage is ideal for our problem. We’ll take Redis for our key-value storage, as it’s reliable &amp; well supported. There’s one extra problem, though- since Redis’s most common usage is being a cache, data is kept in-memory and non-permanent. We certainly don’t want to wake up one day and see our counter turn into 0. Thankfully, most Redis hosts have data persistence options: RDB (Redis Database- snapshotting), which saves a point-in-time snapshot to disk at a time interval, and AOF (Append-Only File), which logs every write command to disk. While RDB is faster to read, one may lose the writes between snapshots. If accuracy is a more important factor to performance, AOF holds an advantage since data is durable, though slower for reads &amp; writes. For our visit counter, we’d choose a combination of both.</w:t>
+        <w:t xml:space="preserve">With fast reads and writes &amp; a flexible data schema that operates well on small data, a key-value storage is ideal for our problem. We’ll take Redis for our key-value storage, as it’s reliable &amp; well supported. There’s one extra problem, though- since Redis’s most common usage is being a cache, data is kept in-memory and non-permanent. We certainly don’t want to wake up one day and see our counter turn into 0. Thankfully, most Redis hosts have data persistence options: RDB (Redis Database- snapshotting), which saves a point-in-time snapshot to disk at a time interval, and AOF (Append-Only File), which logs every write command to disk. While RDB is faster to read, one may lose the writes between snapshots. If accuracy is a more important factor to performance, AOF holds an advantage since data is durable, though slower for reads &amp; writes. For our visit counter, we’d choose a combination of both.</w:t>
       </w:r>
     </w:p>
     <w:p>
@@ -491,7 +775,30 @@
           <w:szCs w:val="24"/>
           <w:rtl w:val="0"/>
         </w:rPr>
-        <w:t xml:space="preserve">We concluded the database layer. Let’s move on to the backend layer before wrapping things up in the frontend. For the backend, we have the 2 aforementioned logics, getting the counter &amp; incrementing the counter. What are the other logics we should be aware of?</w:t>
+        <w:t xml:space="preserve">We concluded the database layer. Let’s move on to the backend layer before wrapping things up in the frontend. </w:t>
+      </w:r>
+      <w:commentRangeStart w:id="0"/>
+      <w:commentRangeStart w:id="1"/>
+      <w:r>
+        <w:rPr>
+          <w:sz w:val="24"/>
+          <w:szCs w:val="24"/>
+          <w:rtl w:val="0"/>
+        </w:rPr>
+        <w:t xml:space="preserve">For the backend, we have the 2 aforementioned logics, getting the counter &amp; incrementing the counter. What are the other logics we should be aware of?</w:t>
+      </w:r>
+      <w:commentRangeEnd w:id="0"/>
+      <w:r>
+        <w:commentReference w:id="0"/>
+      </w:r>
+      <w:commentRangeEnd w:id="1"/>
+      <w:r>
+        <w:commentReference w:id="1"/>
+      </w:r>
+      <w:r>
+        <w:rPr>
+          <w:rtl w:val="0"/>
+        </w:rPr>
       </w:r>
     </w:p>
     <w:p>
@@ -535,6 +842,103 @@
     </w:p>
     <w:p>
       <w:pPr>
+        <w:spacing w:after="240" w:before="240" w:lineRule="auto"/>
+        <w:rPr>
+          <w:sz w:val="24"/>
+          <w:szCs w:val="24"/>
+        </w:rPr>
+      </w:pPr>
+      <w:r>
+        <w:rPr>
+          <w:sz w:val="24"/>
+          <w:szCs w:val="24"/>
+          <w:rtl w:val="0"/>
+        </w:rPr>
+        <w:t xml:space="preserve">Below is a reference for our frontend’s final product (You can give it a visit at </w:t>
+      </w:r>
+      <w:hyperlink r:id="rId11">
+        <w:r>
+          <w:rPr>
+            <w:color w:val="1155cc"/>
+            <w:sz w:val="24"/>
+            <w:szCs w:val="24"/>
+            <w:u w:val="single"/>
+            <w:rtl w:val="0"/>
+          </w:rPr>
+          <w:t xml:space="preserve">https://visit-counter-petercrackthecode.vercel.app/</w:t>
+        </w:r>
+      </w:hyperlink>
+      <w:r>
+        <w:rPr>
+          <w:sz w:val="24"/>
+          <w:szCs w:val="24"/>
+          <w:rtl w:val="0"/>
+        </w:rPr>
+        <w:t xml:space="preserve">!</w:t>
+      </w:r>
+      <w:r>
+        <w:rPr>
+          <w:sz w:val="24"/>
+          <w:szCs w:val="24"/>
+          <w:rtl w:val="0"/>
+        </w:rPr>
+        <w:t xml:space="preserve">):</w:t>
+      </w:r>
+    </w:p>
+    <w:p>
+      <w:pPr>
+        <w:spacing w:after="240" w:before="240" w:lineRule="auto"/>
+        <w:rPr>
+          <w:sz w:val="24"/>
+          <w:szCs w:val="24"/>
+        </w:rPr>
+      </w:pPr>
+      <w:r>
+        <w:rPr>
+          <w:sz w:val="24"/>
+          <w:szCs w:val="24"/>
+        </w:rPr>
+        <w:drawing>
+          <wp:inline distB="114300" distT="114300" distL="114300" distR="114300">
+            <wp:extent cx="6548438" cy="3352800"/>
+            <wp:effectExtent b="0" l="0" r="0" t="0"/>
+            <wp:docPr id="2" name="image4.png"/>
+            <a:graphic>
+              <a:graphicData uri="http://schemas.openxmlformats.org/drawingml/2006/picture">
+                <pic:pic>
+                  <pic:nvPicPr>
+                    <pic:cNvPr id="0" name="image4.png"/>
+                    <pic:cNvPicPr preferRelativeResize="0"/>
+                  </pic:nvPicPr>
+                  <pic:blipFill>
+                    <a:blip r:embed="rId12"/>
+                    <a:srcRect b="0" l="0" r="0" t="0"/>
+                    <a:stretch>
+                      <a:fillRect/>
+                    </a:stretch>
+                  </pic:blipFill>
+                  <pic:spPr>
+                    <a:xfrm>
+                      <a:off x="0" y="0"/>
+                      <a:ext cx="6548438" cy="3352800"/>
+                    </a:xfrm>
+                    <a:prstGeom prst="rect"/>
+                    <a:ln/>
+                  </pic:spPr>
+                </pic:pic>
+              </a:graphicData>
+            </a:graphic>
+          </wp:inline>
+        </w:drawing>
+      </w:r>
+      <w:r>
+        <w:rPr>
+          <w:rtl w:val="0"/>
+        </w:rPr>
+      </w:r>
+    </w:p>
+    <w:p>
+      <w:pPr>
         <w:rPr>
           <w:sz w:val="24"/>
           <w:szCs w:val="24"/>
@@ -562,7 +966,25 @@
           <w:szCs w:val="24"/>
           <w:rtl w:val="0"/>
         </w:rPr>
-        <w:t xml:space="preserve">For the backend, I’m going to use Python with Flask to create a server. We’ll have a `requirements.txt` file to store our Python dependencies:</w:t>
+        <w:t xml:space="preserve">For the backend, I’m going to use Python with Flask to create a server. We’ll have a </w:t>
+      </w:r>
+      <w:r>
+        <w:rPr>
+          <w:rFonts w:ascii="Roboto Mono" w:cs="Roboto Mono" w:eastAsia="Roboto Mono" w:hAnsi="Roboto Mono"/>
+          <w:color w:val="188038"/>
+          <w:sz w:val="24"/>
+          <w:szCs w:val="24"/>
+          <w:rtl w:val="0"/>
+        </w:rPr>
+        <w:t xml:space="preserve">requirements.txt</w:t>
+      </w:r>
+      <w:r>
+        <w:rPr>
+          <w:sz w:val="24"/>
+          <w:szCs w:val="24"/>
+          <w:rtl w:val="0"/>
+        </w:rPr>
+        <w:t xml:space="preserve"> file to store our Python dependencies:</w:t>
       </w:r>
     </w:p>
     <w:p>
@@ -1528,23 +1950,77 @@
           <w:szCs w:val="24"/>
           <w:rtl w:val="0"/>
         </w:rPr>
-        <w:t xml:space="preserve">Then, for our backend, we’ll need a few endpoints: 2 main ones, [GET] /visitors to fetch the number of people who have visited our site and [POST] /visitors to bump the count of visitors by 1; and another one called heartbeat simply to check if our server is alive.</w:t>
-      </w:r>
-    </w:p>
-    <w:p>
-      <w:pPr>
-        <w:rPr>
-          <w:sz w:val="24"/>
-          <w:szCs w:val="24"/>
-        </w:rPr>
-      </w:pPr>
-      <w:r>
-        <w:rPr>
-          <w:sz w:val="24"/>
-          <w:szCs w:val="24"/>
-          <w:rtl w:val="0"/>
-        </w:rPr>
-        <w:t xml:space="preserve">For the rate limiter, we’ll use a Python library compatible with our server called flask_limiter. We only need to apply this rate limiter to our [POST] /visitors endpoint, for that’s the only endpoint we need to prevent other users from tampering with our counter result. The other two endpoints can be free from being rate-limited.</w:t>
+        <w:t xml:space="preserve">Then, for our backend, we’ll need a few endpoints: 2 main ones, </w:t>
+      </w:r>
+      <w:r>
+        <w:rPr>
+          <w:rFonts w:ascii="Roboto Mono" w:cs="Roboto Mono" w:eastAsia="Roboto Mono" w:hAnsi="Roboto Mono"/>
+          <w:color w:val="188038"/>
+          <w:sz w:val="24"/>
+          <w:szCs w:val="24"/>
+          <w:rtl w:val="0"/>
+        </w:rPr>
+        <w:t xml:space="preserve">[GET] /visitors</w:t>
+      </w:r>
+      <w:r>
+        <w:rPr>
+          <w:sz w:val="24"/>
+          <w:szCs w:val="24"/>
+          <w:rtl w:val="0"/>
+        </w:rPr>
+        <w:t xml:space="preserve"> to fetch the number of people who have visited our site and </w:t>
+      </w:r>
+      <w:r>
+        <w:rPr>
+          <w:rFonts w:ascii="Roboto Mono" w:cs="Roboto Mono" w:eastAsia="Roboto Mono" w:hAnsi="Roboto Mono"/>
+          <w:color w:val="188038"/>
+          <w:sz w:val="24"/>
+          <w:szCs w:val="24"/>
+          <w:rtl w:val="0"/>
+        </w:rPr>
+        <w:t xml:space="preserve">[POST] /visitors</w:t>
+      </w:r>
+      <w:r>
+        <w:rPr>
+          <w:sz w:val="24"/>
+          <w:szCs w:val="24"/>
+          <w:rtl w:val="0"/>
+        </w:rPr>
+        <w:t xml:space="preserve"> to bump the count of visitors by 1; and another one called heartbeat simply to check if our server is alive.</w:t>
+      </w:r>
+    </w:p>
+    <w:p>
+      <w:pPr>
+        <w:rPr>
+          <w:sz w:val="24"/>
+          <w:szCs w:val="24"/>
+        </w:rPr>
+      </w:pPr>
+      <w:r>
+        <w:rPr>
+          <w:sz w:val="24"/>
+          <w:szCs w:val="24"/>
+          <w:rtl w:val="0"/>
+        </w:rPr>
+        <w:t xml:space="preserve">For the rate limiter, we’ll use a Python library compatible with our server called flask_limiter. We only need to apply this rate limiter to our </w:t>
+      </w:r>
+      <w:r>
+        <w:rPr>
+          <w:rFonts w:ascii="Roboto Mono" w:cs="Roboto Mono" w:eastAsia="Roboto Mono" w:hAnsi="Roboto Mono"/>
+          <w:color w:val="188038"/>
+          <w:sz w:val="24"/>
+          <w:szCs w:val="24"/>
+          <w:rtl w:val="0"/>
+        </w:rPr>
+        <w:t xml:space="preserve">[POST] /visitors</w:t>
+      </w:r>
+      <w:r>
+        <w:rPr>
+          <w:sz w:val="24"/>
+          <w:szCs w:val="24"/>
+          <w:rtl w:val="0"/>
+        </w:rPr>
+        <w:t xml:space="preserve"> endpoint, for that’s the only endpoint we need to prevent other users from tampering with our counter result. The other two endpoints can be free from being rate-limited.</w:t>
       </w:r>
     </w:p>
     <w:p>
@@ -4920,6 +5396,19 @@
       </w:pPr>
       <w:r>
         <w:rPr>
+          <w:rtl w:val="0"/>
+        </w:rPr>
+      </w:r>
+    </w:p>
+    <w:p>
+      <w:pPr>
+        <w:rPr>
+          <w:sz w:val="24"/>
+          <w:szCs w:val="24"/>
+        </w:rPr>
+      </w:pPr>
+      <w:r>
+        <w:rPr>
           <w:sz w:val="24"/>
           <w:szCs w:val="24"/>
           <w:rtl w:val="0"/>
@@ -4936,27 +5425,79 @@
       </w:pPr>
       <w:r>
         <w:rPr>
-          <w:sz w:val="24"/>
-          <w:szCs w:val="24"/>
-          <w:rtl w:val="0"/>
-        </w:rPr>
-        <w:t xml:space="preserve">First, we import all the necessary libraries for our app. Then, we allow the backend to be called from different frontend origins through the `CORS(app)` piece. Though this is not ideal for production, for development &amp; the demo purposes, it’s justifiable to allow requests from all sites.</w:t>
-      </w:r>
-    </w:p>
-    <w:p>
-      <w:pPr>
-        <w:rPr>
-          <w:sz w:val="24"/>
-          <w:szCs w:val="24"/>
-        </w:rPr>
-      </w:pPr>
-      <w:r>
-        <w:rPr>
-          <w:sz w:val="24"/>
-          <w:szCs w:val="24"/>
-          <w:rtl w:val="0"/>
-        </w:rPr>
-        <w:t xml:space="preserve">Then, we get all the URLs for our Redis client- in this case, our key-value database. Some may ask: What’s up with the Redis’ connection pool? Why don’t we connect to the Redis client directly?</w:t>
+          <w:rtl w:val="0"/>
+        </w:rPr>
+      </w:r>
+    </w:p>
+    <w:p>
+      <w:pPr>
+        <w:rPr>
+          <w:sz w:val="24"/>
+          <w:szCs w:val="24"/>
+        </w:rPr>
+      </w:pPr>
+      <w:r>
+        <w:rPr>
+          <w:sz w:val="24"/>
+          <w:szCs w:val="24"/>
+          <w:rtl w:val="0"/>
+        </w:rPr>
+        <w:t xml:space="preserve">First, we import all the necessary libraries for our app. Then, we allow the backend to be called from different frontend origins through the </w:t>
+      </w:r>
+      <w:r>
+        <w:rPr>
+          <w:rFonts w:ascii="Roboto Mono" w:cs="Roboto Mono" w:eastAsia="Roboto Mono" w:hAnsi="Roboto Mono"/>
+          <w:color w:val="188038"/>
+          <w:sz w:val="24"/>
+          <w:szCs w:val="24"/>
+          <w:rtl w:val="0"/>
+        </w:rPr>
+        <w:t xml:space="preserve">CORS(app)</w:t>
+      </w:r>
+      <w:r>
+        <w:rPr>
+          <w:sz w:val="24"/>
+          <w:szCs w:val="24"/>
+          <w:rtl w:val="0"/>
+        </w:rPr>
+        <w:t xml:space="preserve"> piece. Though this is not ideal for production, for development &amp; the demo purposes, it’s justifiable to allow requests from all sites.</w:t>
+      </w:r>
+    </w:p>
+    <w:p>
+      <w:pPr>
+        <w:rPr>
+          <w:sz w:val="24"/>
+          <w:szCs w:val="24"/>
+        </w:rPr>
+      </w:pPr>
+      <w:r>
+        <w:rPr>
+          <w:sz w:val="24"/>
+          <w:szCs w:val="24"/>
+          <w:rtl w:val="0"/>
+        </w:rPr>
+        <w:t xml:space="preserve">Then, we get all the URLs for our Redis client- in this case, our key-value database. Some may ask: What’s up with the </w:t>
+      </w:r>
+      <w:commentRangeStart w:id="2"/>
+      <w:r>
+        <w:rPr>
+          <w:sz w:val="24"/>
+          <w:szCs w:val="24"/>
+          <w:rtl w:val="0"/>
+        </w:rPr>
+        <w:t xml:space="preserve">Redis’</w:t>
+      </w:r>
+      <w:commentRangeEnd w:id="2"/>
+      <w:r>
+        <w:commentReference w:id="2"/>
+      </w:r>
+      <w:r>
+        <w:rPr>
+          <w:sz w:val="24"/>
+          <w:szCs w:val="24"/>
+          <w:rtl w:val="0"/>
+        </w:rPr>
+        <w:t xml:space="preserve"> connection pool? Why don’t we connect to the Redis client directly?</w:t>
       </w:r>
     </w:p>
     <w:p>
@@ -4988,7 +5529,7 @@
           <w:szCs w:val="24"/>
           <w:rtl w:val="0"/>
         </w:rPr>
-        <w:t xml:space="preserve">That’s where the connection pool comes in. In our example, we create 20 connections to Redis &amp; leave them alive both before and after using them. Once a request requires Redis, it takes any available connections from the pool, uses it, and returns it alive after having done the job.</w:t>
+        <w:t xml:space="preserve">That’s where the connection pool comes in. In our example, we create 20 connections to Redis &amp; leave them alive both before and after using them. Once a request requires Redis, it takes any available connections from the pool, uses them, and returns them alive after having done the job.</w:t>
       </w:r>
     </w:p>
     <w:p>
@@ -5052,23 +5593,147 @@
           <w:szCs w:val="24"/>
           <w:rtl w:val="0"/>
         </w:rPr>
-        <w:t xml:space="preserve">There’s one interesting thing about the [POST] endpoint of bumping the visitor count, however. We mentioned handling race conditions of multiple requests trying to bump the counter up, so where is that handler at? The actual implementation is more implicit: within the `incr` command at the [POST] endpoint. This command is atomic, which means at any moment there’s only one full command of increments (incr) being run, which entails the full steps of read-modify-write. The command won’t stop until having finished the said steps or hitting a timeout. This out-of-the-box support to handle race conditions is a bonus on why we chose Redis in the 1st place.</w:t>
-      </w:r>
-    </w:p>
-    <w:p>
-      <w:pPr>
-        <w:rPr>
-          <w:sz w:val="24"/>
-          <w:szCs w:val="24"/>
-        </w:rPr>
-      </w:pPr>
-      <w:r>
-        <w:rPr>
-          <w:sz w:val="24"/>
-          <w:szCs w:val="24"/>
-          <w:rtl w:val="0"/>
-        </w:rPr>
-        <w:t xml:space="preserve">One more nuance is the `redis.setnx` command, as you may see within the `get_counter` function. In Redis, if you get a key that doesn’t exist, you will get a `None` value in Python, which is less ideal for our response. Thus, we call `redis.setnx` to set the initial value of the counter in case we didn’t initiate the counter.</w:t>
+        <w:t xml:space="preserve">There’s one interesting thing about the </w:t>
+      </w:r>
+      <w:r>
+        <w:rPr>
+          <w:rFonts w:ascii="Roboto Mono" w:cs="Roboto Mono" w:eastAsia="Roboto Mono" w:hAnsi="Roboto Mono"/>
+          <w:color w:val="188038"/>
+          <w:sz w:val="24"/>
+          <w:szCs w:val="24"/>
+          <w:rtl w:val="0"/>
+        </w:rPr>
+        <w:t xml:space="preserve">[POST]</w:t>
+      </w:r>
+      <w:r>
+        <w:rPr>
+          <w:sz w:val="24"/>
+          <w:szCs w:val="24"/>
+          <w:rtl w:val="0"/>
+        </w:rPr>
+        <w:t xml:space="preserve"> endpoint of bumping the visitor count, however. We mentioned handling race conditions of multiple requests trying to bump the counter up, </w:t>
+      </w:r>
+      <w:r>
+        <w:rPr>
+          <w:sz w:val="24"/>
+          <w:szCs w:val="24"/>
+          <w:rtl w:val="0"/>
+        </w:rPr>
+        <w:t xml:space="preserve">so where </w:t>
+      </w:r>
+      <w:r>
+        <w:rPr>
+          <w:sz w:val="24"/>
+          <w:szCs w:val="24"/>
+          <w:rtl w:val="0"/>
+        </w:rPr>
+        <w:t xml:space="preserve">are we doing that? The actual implementation is more implicit: within the `incr` command at the </w:t>
+      </w:r>
+      <w:r>
+        <w:rPr>
+          <w:rFonts w:ascii="Roboto Mono" w:cs="Roboto Mono" w:eastAsia="Roboto Mono" w:hAnsi="Roboto Mono"/>
+          <w:color w:val="188038"/>
+          <w:sz w:val="24"/>
+          <w:szCs w:val="24"/>
+          <w:rtl w:val="0"/>
+        </w:rPr>
+        <w:t xml:space="preserve">[POST]</w:t>
+      </w:r>
+      <w:r>
+        <w:rPr>
+          <w:sz w:val="24"/>
+          <w:szCs w:val="24"/>
+          <w:rtl w:val="0"/>
+        </w:rPr>
+        <w:t xml:space="preserve"> endpoint. This command is atomic, which means at any moment there’s only one full command of increments (incr) being run, which entails the full steps of read-modify-write. The command won’t stop until it has finished the said steps or hits a timeout. This out-of-the-box support to handle race conditions is a bonus on why we chose Redis in the 1st place.</w:t>
+      </w:r>
+    </w:p>
+    <w:p>
+      <w:pPr>
+        <w:rPr>
+          <w:sz w:val="24"/>
+          <w:szCs w:val="24"/>
+        </w:rPr>
+      </w:pPr>
+      <w:r>
+        <w:rPr>
+          <w:sz w:val="24"/>
+          <w:szCs w:val="24"/>
+          <w:rtl w:val="0"/>
+        </w:rPr>
+        <w:t xml:space="preserve">One more nuance is the </w:t>
+      </w:r>
+      <w:r>
+        <w:rPr>
+          <w:rFonts w:ascii="Roboto Mono" w:cs="Roboto Mono" w:eastAsia="Roboto Mono" w:hAnsi="Roboto Mono"/>
+          <w:color w:val="188038"/>
+          <w:sz w:val="24"/>
+          <w:szCs w:val="24"/>
+          <w:rtl w:val="0"/>
+        </w:rPr>
+        <w:t xml:space="preserve">redis.setnx</w:t>
+      </w:r>
+      <w:r>
+        <w:rPr>
+          <w:sz w:val="24"/>
+          <w:szCs w:val="24"/>
+          <w:rtl w:val="0"/>
+        </w:rPr>
+        <w:t xml:space="preserve"> command, as you may see within the </w:t>
+      </w:r>
+      <w:r>
+        <w:rPr>
+          <w:rFonts w:ascii="Roboto Mono" w:cs="Roboto Mono" w:eastAsia="Roboto Mono" w:hAnsi="Roboto Mono"/>
+          <w:color w:val="188038"/>
+          <w:sz w:val="24"/>
+          <w:szCs w:val="24"/>
+          <w:rtl w:val="0"/>
+        </w:rPr>
+        <w:t xml:space="preserve">get_counter</w:t>
+      </w:r>
+      <w:r>
+        <w:rPr>
+          <w:sz w:val="24"/>
+          <w:szCs w:val="24"/>
+          <w:rtl w:val="0"/>
+        </w:rPr>
+        <w:t xml:space="preserve"> function. In Redis, if you get a key that doesn’t exist, you will get a </w:t>
+      </w:r>
+      <w:r>
+        <w:rPr>
+          <w:rFonts w:ascii="Roboto Mono" w:cs="Roboto Mono" w:eastAsia="Roboto Mono" w:hAnsi="Roboto Mono"/>
+          <w:color w:val="188038"/>
+          <w:sz w:val="24"/>
+          <w:szCs w:val="24"/>
+          <w:rtl w:val="0"/>
+        </w:rPr>
+        <w:t xml:space="preserve">None</w:t>
+      </w:r>
+      <w:r>
+        <w:rPr>
+          <w:sz w:val="24"/>
+          <w:szCs w:val="24"/>
+          <w:rtl w:val="0"/>
+        </w:rPr>
+        <w:t xml:space="preserve"> value in Python, which is less ideal for our response. Thus, we call </w:t>
+      </w:r>
+      <w:r>
+        <w:rPr>
+          <w:rFonts w:ascii="Roboto Mono" w:cs="Roboto Mono" w:eastAsia="Roboto Mono" w:hAnsi="Roboto Mono"/>
+          <w:color w:val="188038"/>
+          <w:sz w:val="24"/>
+          <w:szCs w:val="24"/>
+          <w:rtl w:val="0"/>
+        </w:rPr>
+        <w:t xml:space="preserve">redis.setnx</w:t>
+      </w:r>
+      <w:r>
+        <w:rPr>
+          <w:sz w:val="24"/>
+          <w:szCs w:val="24"/>
+          <w:rtl w:val="0"/>
+        </w:rPr>
+        <w:t xml:space="preserve"> to set the initial value of the counter in case we didn’t initiate the counter.</w:t>
       </w:r>
     </w:p>
     <w:p>
@@ -5097,11 +5762,25 @@
       </w:pPr>
       <w:r>
         <w:rPr>
-          <w:sz w:val="24"/>
-          <w:szCs w:val="24"/>
-          <w:rtl w:val="0"/>
-        </w:rPr>
-        <w:t xml:space="preserve">For our frontend, here’s our code:</w:t>
+          <w:rtl w:val="0"/>
+        </w:rPr>
+      </w:r>
+    </w:p>
+    <w:p>
+      <w:pPr>
+        <w:spacing w:after="120" w:lineRule="auto"/>
+        <w:rPr>
+          <w:sz w:val="24"/>
+          <w:szCs w:val="24"/>
+        </w:rPr>
+      </w:pPr>
+      <w:r>
+        <w:rPr>
+          <w:sz w:val="24"/>
+          <w:szCs w:val="24"/>
+          <w:rtl w:val="0"/>
+        </w:rPr>
+        <w:t xml:space="preserve">For our frontend, here’s the code:</w:t>
       </w:r>
     </w:p>
     <w:p>
@@ -10895,11 +11574,42 @@
       </w:pPr>
       <w:r>
         <w:rPr>
-          <w:sz w:val="24"/>
-          <w:szCs w:val="24"/>
-          <w:rtl w:val="0"/>
-        </w:rPr>
-        <w:t xml:space="preserve">We’ll first make a [POST] request to increment our counter by 1. The [POST] request may return a visit counter, which we display to the client. Otherwise, if we get rate-limited where the backend returns a 429 status code, that means the user has visited the website more than once in the last 30 minutes (our rate-limit window), we default it back to the [GET] endpoint to get the current visit counter. </w:t>
+          <w:rtl w:val="0"/>
+        </w:rPr>
+      </w:r>
+    </w:p>
+    <w:p>
+      <w:pPr>
+        <w:rPr>
+          <w:sz w:val="24"/>
+          <w:szCs w:val="24"/>
+        </w:rPr>
+      </w:pPr>
+      <w:r>
+        <w:rPr>
+          <w:sz w:val="24"/>
+          <w:szCs w:val="24"/>
+          <w:rtl w:val="0"/>
+        </w:rPr>
+        <w:t xml:space="preserve">We’ll first make a </w:t>
+      </w:r>
+      <w:r>
+        <w:rPr>
+          <w:rFonts w:ascii="Roboto Mono" w:cs="Roboto Mono" w:eastAsia="Roboto Mono" w:hAnsi="Roboto Mono"/>
+          <w:color w:val="188038"/>
+          <w:sz w:val="24"/>
+          <w:szCs w:val="24"/>
+          <w:rtl w:val="0"/>
+        </w:rPr>
+        <w:t xml:space="preserve">[POST]</w:t>
+      </w:r>
+      <w:r>
+        <w:rPr>
+          <w:sz w:val="24"/>
+          <w:szCs w:val="24"/>
+          <w:rtl w:val="0"/>
+        </w:rPr>
+        <w:t xml:space="preserve"> request to increment our counter by 1. The [POST] request may return a visit counter, which we display to the client. Otherwise, if we get rate-limited where the backend returns a 429 status code, that means the user has visited the website more than once in the last 30 minutes (our rate-limit window), we default it back to the [GET] endpoint to get the current visit counter. </w:t>
       </w:r>
     </w:p>
     <w:p>
@@ -10932,6 +11642,50 @@
           <w:rtl w:val="0"/>
         </w:rPr>
         <w:t xml:space="preserve">And that’s it. We now have a basic website to count the number of people who visit our site. It’s just a few hundred lines of code overall, yet it gives us great metrics on our website’s traffic.</w:t>
+      </w:r>
+    </w:p>
+    <w:p>
+      <w:pPr>
+        <w:rPr>
+          <w:sz w:val="24"/>
+          <w:szCs w:val="24"/>
+        </w:rPr>
+      </w:pPr>
+      <w:r>
+        <w:rPr>
+          <w:rtl w:val="0"/>
+        </w:rPr>
+      </w:r>
+    </w:p>
+    <w:p>
+      <w:pPr>
+        <w:rPr>
+          <w:sz w:val="24"/>
+          <w:szCs w:val="24"/>
+        </w:rPr>
+      </w:pPr>
+      <w:r>
+        <w:pict>
+          <v:rect style="width:0.0pt;height:1.5pt" o:hr="t" o:hrstd="t" o:hralign="center" fillcolor="#A0A0A0" stroked="f"/>
+        </w:pict>
+      </w:r>
+      <w:r>
+        <w:rPr>
+          <w:rtl w:val="0"/>
+        </w:rPr>
+      </w:r>
+    </w:p>
+    <w:p>
+      <w:pPr>
+        <w:rPr>
+          <w:sz w:val="24"/>
+          <w:szCs w:val="24"/>
+        </w:rPr>
+      </w:pPr>
+      <w:r>
+        <w:rPr>
+          <w:rtl w:val="0"/>
+        </w:rPr>
       </w:r>
     </w:p>
     <w:p>
@@ -10969,7 +11723,23 @@
           <w:szCs w:val="24"/>
           <w:rtl w:val="0"/>
         </w:rPr>
-        <w:t xml:space="preserve">Making the backend an embeddable widget to other can attach our visit counter to their website within a script.</w:t>
+        <w:t xml:space="preserve">Making the backend an embeddable widget, so </w:t>
+      </w:r>
+      <w:r>
+        <w:rPr>
+          <w:sz w:val="24"/>
+          <w:szCs w:val="24"/>
+          <w:rtl w:val="0"/>
+        </w:rPr>
+        <w:t xml:space="preserve">other</w:t>
+      </w:r>
+      <w:r>
+        <w:rPr>
+          <w:sz w:val="24"/>
+          <w:szCs w:val="24"/>
+          <w:rtl w:val="0"/>
+        </w:rPr>
+        <w:t xml:space="preserve">s can attach our visit counter to their website within a script.</w:t>
       </w:r>
     </w:p>
     <w:p>
@@ -11013,7 +11783,7 @@
           <w:szCs w:val="24"/>
           <w:rtl w:val="0"/>
         </w:rPr>
-        <w:t xml:space="preserve"> Monitoring: we’ll need to be alarmed when any components of our system are down. How can we set up robust monitoring and be quickly notified when our site is affected?</w:t>
+        <w:t xml:space="preserve"> Monitoring: We’ll need to be alerted when any components of our system are down. How can we set up robust monitoring and be quickly notified when our site is affected?</w:t>
       </w:r>
     </w:p>
     <w:p>
@@ -11044,6 +11814,53 @@
         <w:rPr>
           <w:rtl w:val="0"/>
         </w:rPr>
+      </w:r>
+    </w:p>
+    <w:p>
+      <w:pPr>
+        <w:rPr>
+          <w:sz w:val="24"/>
+          <w:szCs w:val="24"/>
+        </w:rPr>
+      </w:pPr>
+      <w:r>
+        <w:rPr>
+          <w:rtl w:val="0"/>
+        </w:rPr>
+      </w:r>
+    </w:p>
+    <w:p>
+      <w:pPr>
+        <w:rPr>
+          <w:sz w:val="24"/>
+          <w:szCs w:val="24"/>
+        </w:rPr>
+      </w:pPr>
+      <w:r>
+        <w:pict>
+          <v:rect style="width:0.0pt;height:1.5pt" o:hr="t" o:hrstd="t" o:hralign="center" fillcolor="#A0A0A0" stroked="f"/>
+        </w:pict>
+      </w:r>
+      <w:r>
+        <w:rPr>
+          <w:rtl w:val="0"/>
+        </w:rPr>
+      </w:r>
+    </w:p>
+    <w:p>
+      <w:pPr>
+        <w:rPr>
+          <w:sz w:val="24"/>
+          <w:szCs w:val="24"/>
+        </w:rPr>
+      </w:pPr>
+      <w:r>
+        <w:rPr>
+          <w:sz w:val="24"/>
+          <w:szCs w:val="24"/>
+          <w:rtl w:val="0"/>
+        </w:rPr>
+        <w:t xml:space="preserve">Thanks to Jaewon Lee &amp; Advay Pal for proofreading this blog.</w:t>
       </w:r>
     </w:p>
     <w:sectPr>
@@ -11053,6 +11870,176 @@
     </w:sectPr>
   </w:body>
 </w:document>
+</file>
+
+<file path=word/comments.xml><?xml version="1.0" encoding="utf-8"?>
+<w:comments xmlns:mc="http://schemas.openxmlformats.org/markup-compatibility/2006" xmlns:o="urn:schemas-microsoft-com:office:office" xmlns:r="http://schemas.openxmlformats.org/officeDocument/2006/relationships" xmlns:m="http://schemas.openxmlformats.org/officeDocument/2006/math" xmlns:v="urn:schemas-microsoft-com:vml" xmlns:wp="http://schemas.openxmlformats.org/drawingml/2006/wordprocessingDrawing" xmlns:w10="urn:schemas-microsoft-com:office:word" xmlns:w="http://schemas.openxmlformats.org/wordprocessingml/2006/main" xmlns:wne="http://schemas.microsoft.com/office/word/2006/wordml" xmlns:sl="http://schemas.openxmlformats.org/schemaLibrary/2006/main" xmlns:a="http://schemas.openxmlformats.org/drawingml/2006/main" xmlns:pic="http://schemas.openxmlformats.org/drawingml/2006/picture" xmlns:c="http://schemas.openxmlformats.org/drawingml/2006/chart" xmlns:lc="http://schemas.openxmlformats.org/drawingml/2006/lockedCanvas" xmlns:dgm="http://schemas.openxmlformats.org/drawingml/2006/diagram" xmlns:wps="http://schemas.microsoft.com/office/word/2010/wordprocessingShape" xmlns:wpg="http://schemas.microsoft.com/office/word/2010/wordprocessingGroup" xmlns:w14="http://schemas.microsoft.com/office/word/2010/wordml" xmlns:w15="http://schemas.microsoft.com/office/word/2012/wordml" xmlns:w16="http://schemas.microsoft.com/office/word/2018/wordml" xmlns:w16cex="http://schemas.microsoft.com/office/word/2018/wordml/cex" xmlns:w16cid="http://schemas.microsoft.com/office/word/2016/wordml/cid" xmlns="http://schemas.microsoft.com/office/tasks/2019/documenttasks" xmlns:cr="http://schemas.microsoft.com/office/comments/2020/reactions">
+  <w:comment w:author="Advay Pal" w:id="2" w:date="2026-03-17T23:50:36Z">
+    <w:p>
+      <w:pPr>
+        <w:keepNext w:val="0"/>
+        <w:keepLines w:val="0"/>
+        <w:pageBreakBefore w:val="0"/>
+        <w:widowControl w:val="0"/>
+        <w:pBdr>
+          <w:top w:space="0" w:sz="0" w:val="nil"/>
+          <w:left w:space="0" w:sz="0" w:val="nil"/>
+          <w:bottom w:space="0" w:sz="0" w:val="nil"/>
+          <w:right w:space="0" w:sz="0" w:val="nil"/>
+          <w:between w:space="0" w:sz="0" w:val="nil"/>
+        </w:pBdr>
+        <w:shd w:fill="auto" w:val="clear"/>
+        <w:spacing w:after="0" w:before="0" w:line="240" w:lineRule="auto"/>
+        <w:ind w:left="0" w:right="0" w:firstLine="0"/>
+        <w:jc w:val="left"/>
+        <w:rPr>
+          <w:rFonts w:ascii="Arial" w:cs="Arial" w:eastAsia="Arial" w:hAnsi="Arial"/>
+          <w:b w:val="0"/>
+          <w:bCs w:val="0"/>
+          <w:i w:val="0"/>
+          <w:iCs w:val="0"/>
+          <w:smallCaps w:val="0"/>
+          <w:strike w:val="0"/>
+          <w:color w:val="000000"/>
+          <w:sz w:val="22"/>
+          <w:szCs w:val="22"/>
+          <w:u w:val="none"/>
+          <w:shd w:fill="auto" w:val="clear"/>
+          <w:vertAlign w:val="baseline"/>
+        </w:rPr>
+      </w:pPr>
+      <w:r>
+        <w:rPr>
+          <w:rFonts w:ascii="Arial" w:cs="Arial" w:eastAsia="Arial" w:hAnsi="Arial"/>
+          <w:b w:val="0"/>
+          <w:bCs w:val="0"/>
+          <w:i w:val="0"/>
+          <w:iCs w:val="0"/>
+          <w:smallCaps w:val="0"/>
+          <w:strike w:val="0"/>
+          <w:color w:val="000000"/>
+          <w:sz w:val="22"/>
+          <w:szCs w:val="22"/>
+          <w:u w:val="none"/>
+          <w:shd w:fill="auto" w:val="clear"/>
+          <w:vertAlign w:val="baseline"/>
+          <w:rtl w:val="0"/>
+        </w:rPr>
+        <w:t xml:space="preserve">Redis, not Redis'</w:t>
+      </w:r>
+    </w:p>
+  </w:comment>
+  <w:comment w:author="Advay Pal" w:id="0" w:date="2026-03-17T23:45:37Z">
+    <w:p>
+      <w:pPr>
+        <w:keepNext w:val="0"/>
+        <w:keepLines w:val="0"/>
+        <w:pageBreakBefore w:val="0"/>
+        <w:widowControl w:val="0"/>
+        <w:pBdr>
+          <w:top w:space="0" w:sz="0" w:val="nil"/>
+          <w:left w:space="0" w:sz="0" w:val="nil"/>
+          <w:bottom w:space="0" w:sz="0" w:val="nil"/>
+          <w:right w:space="0" w:sz="0" w:val="nil"/>
+          <w:between w:space="0" w:sz="0" w:val="nil"/>
+        </w:pBdr>
+        <w:shd w:fill="auto" w:val="clear"/>
+        <w:spacing w:after="0" w:before="0" w:line="240" w:lineRule="auto"/>
+        <w:ind w:left="0" w:right="0" w:firstLine="0"/>
+        <w:jc w:val="left"/>
+        <w:rPr>
+          <w:rFonts w:ascii="Arial" w:cs="Arial" w:eastAsia="Arial" w:hAnsi="Arial"/>
+          <w:b w:val="0"/>
+          <w:bCs w:val="0"/>
+          <w:i w:val="0"/>
+          <w:iCs w:val="0"/>
+          <w:smallCaps w:val="0"/>
+          <w:strike w:val="0"/>
+          <w:color w:val="000000"/>
+          <w:sz w:val="22"/>
+          <w:szCs w:val="22"/>
+          <w:u w:val="none"/>
+          <w:shd w:fill="auto" w:val="clear"/>
+          <w:vertAlign w:val="baseline"/>
+        </w:rPr>
+      </w:pPr>
+      <w:r>
+        <w:rPr>
+          <w:rFonts w:ascii="Arial" w:cs="Arial" w:eastAsia="Arial" w:hAnsi="Arial"/>
+          <w:b w:val="0"/>
+          <w:bCs w:val="0"/>
+          <w:i w:val="0"/>
+          <w:iCs w:val="0"/>
+          <w:smallCaps w:val="0"/>
+          <w:strike w:val="0"/>
+          <w:color w:val="000000"/>
+          <w:sz w:val="22"/>
+          <w:szCs w:val="22"/>
+          <w:u w:val="none"/>
+          <w:shd w:fill="auto" w:val="clear"/>
+          <w:vertAlign w:val="baseline"/>
+          <w:rtl w:val="0"/>
+        </w:rPr>
+        <w:t xml:space="preserve">what do you mean by 'logics' here?</w:t>
+      </w:r>
+    </w:p>
+  </w:comment>
+  <w:comment w:author="Peter Nguyen" w:id="1" w:date="2026-03-18T04:39:51Z">
+    <w:p>
+      <w:pPr>
+        <w:keepNext w:val="0"/>
+        <w:keepLines w:val="0"/>
+        <w:pageBreakBefore w:val="0"/>
+        <w:widowControl w:val="0"/>
+        <w:pBdr>
+          <w:top w:space="0" w:sz="0" w:val="nil"/>
+          <w:left w:space="0" w:sz="0" w:val="nil"/>
+          <w:bottom w:space="0" w:sz="0" w:val="nil"/>
+          <w:right w:space="0" w:sz="0" w:val="nil"/>
+          <w:between w:space="0" w:sz="0" w:val="nil"/>
+        </w:pBdr>
+        <w:shd w:fill="auto" w:val="clear"/>
+        <w:spacing w:after="0" w:before="0" w:line="240" w:lineRule="auto"/>
+        <w:ind w:left="0" w:right="0" w:firstLine="0"/>
+        <w:jc w:val="left"/>
+        <w:rPr>
+          <w:rFonts w:ascii="Arial" w:cs="Arial" w:eastAsia="Arial" w:hAnsi="Arial"/>
+          <w:b w:val="0"/>
+          <w:bCs w:val="0"/>
+          <w:i w:val="0"/>
+          <w:iCs w:val="0"/>
+          <w:smallCaps w:val="0"/>
+          <w:strike w:val="0"/>
+          <w:color w:val="000000"/>
+          <w:sz w:val="22"/>
+          <w:szCs w:val="22"/>
+          <w:u w:val="none"/>
+          <w:shd w:fill="auto" w:val="clear"/>
+          <w:vertAlign w:val="baseline"/>
+        </w:rPr>
+      </w:pPr>
+      <w:r>
+        <w:rPr>
+          <w:rFonts w:ascii="Arial" w:cs="Arial" w:eastAsia="Arial" w:hAnsi="Arial"/>
+          <w:b w:val="0"/>
+          <w:bCs w:val="0"/>
+          <w:i w:val="0"/>
+          <w:iCs w:val="0"/>
+          <w:smallCaps w:val="0"/>
+          <w:strike w:val="0"/>
+          <w:color w:val="000000"/>
+          <w:sz w:val="22"/>
+          <w:szCs w:val="22"/>
+          <w:u w:val="none"/>
+          <w:shd w:fill="auto" w:val="clear"/>
+          <w:vertAlign w:val="baseline"/>
+          <w:rtl w:val="0"/>
+        </w:rPr>
+        <w:t xml:space="preserve">- 2 endpoints: GET to get the counter &amp; POST to increment the counter.</w:t>
+      </w:r>
+    </w:p>
+  </w:comment>
+</w:comments>
 </file>
 
 <file path=word/numbering.xml><?xml version="1.0" encoding="utf-8"?>

</xml_diff>